<commit_message>
Add missing its_physicians_def2.png to both docx files (now 8 figures each), renumber figures
Co-Authored-By: Tatsuki Onishi <bougtoir@gmail.com>
</commit_message>
<xml_diff>
--- a/medical_accident_its_analysis/manuscript/bmj_manuscript.docx
+++ b/medical_accident_its_analysis/manuscript/bmj_manuscript.docx
@@ -2028,7 +2028,60 @@
           <w:i/>
           <w:sz w:val="20"/>
         </w:rPr>
-        <w:t>Figure 2. Interrupted time series plots for physician counts against JMSR incident reports for the 12 core specialties. Fitted segmented regression lines are shown with the vertical dashed line indicating the intervention year (year of peak incident reporting).</w:t>
+        <w:t>Figure 2. Interrupted time series plots for physician counts against JMSR incident reports (Definition 1) for the 12 core specialties. Fitted segmented regression lines are shown with the vertical dashed line indicating the intervention year (year of peak incident reporting).</w:t>
+      </w:r>
+    </w:p>
+    <w:p>
+      <w:pPr>
+        <w:jc w:val="center"/>
+      </w:pPr>
+      <w:r>
+        <w:drawing>
+          <wp:inline xmlns:a="http://schemas.openxmlformats.org/drawingml/2006/main" xmlns:pic="http://schemas.openxmlformats.org/drawingml/2006/picture">
+            <wp:extent cx="5486400" cy="6499132"/>
+            <wp:docPr id="3" name="Picture 3"/>
+            <wp:cNvGraphicFramePr>
+              <a:graphicFrameLocks noChangeAspect="1"/>
+            </wp:cNvGraphicFramePr>
+            <a:graphic>
+              <a:graphicData uri="http://schemas.openxmlformats.org/drawingml/2006/picture">
+                <pic:pic>
+                  <pic:nvPicPr>
+                    <pic:cNvPr id="0" name="its_physicians_def2.png"/>
+                    <pic:cNvPicPr/>
+                  </pic:nvPicPr>
+                  <pic:blipFill>
+                    <a:blip r:embed="rId11"/>
+                    <a:stretch>
+                      <a:fillRect/>
+                    </a:stretch>
+                  </pic:blipFill>
+                  <pic:spPr>
+                    <a:xfrm>
+                      <a:off x="0" y="0"/>
+                      <a:ext cx="5486400" cy="6499132"/>
+                    </a:xfrm>
+                    <a:prstGeom prst="rect"/>
+                  </pic:spPr>
+                </pic:pic>
+              </a:graphicData>
+            </a:graphic>
+          </wp:inline>
+        </w:drawing>
+      </w:r>
+    </w:p>
+    <w:p>
+      <w:pPr>
+        <w:spacing w:after="240" w:line="480" w:lineRule="auto"/>
+        <w:jc w:val="left"/>
+      </w:pPr>
+      <w:r>
+        <w:rPr>
+          <w:rFonts w:ascii="Times New Roman" w:hAnsi="Times New Roman"/>
+          <w:i/>
+          <w:sz w:val="20"/>
+        </w:rPr>
+        <w:t>Figure 3. Interrupted time series plots for physician counts against medical malpractice litigation statistics (Definition 2) for the 12 core specialties. Fitted segmented regression lines are shown with the vertical dashed line indicating the intervention year.</w:t>
       </w:r>
     </w:p>
     <w:p>
@@ -2988,7 +3041,7 @@
         <w:drawing>
           <wp:inline xmlns:a="http://schemas.openxmlformats.org/drawingml/2006/main" xmlns:pic="http://schemas.openxmlformats.org/drawingml/2006/picture">
             <wp:extent cx="5486400" cy="2774866"/>
-            <wp:docPr id="3" name="Picture 3"/>
+            <wp:docPr id="4" name="Picture 4"/>
             <wp:cNvGraphicFramePr>
               <a:graphicFrameLocks noChangeAspect="1"/>
             </wp:cNvGraphicFramePr>
@@ -3000,7 +3053,7 @@
                     <pic:cNvPicPr/>
                   </pic:nvPicPr>
                   <pic:blipFill>
-                    <a:blip r:embed="rId11"/>
+                    <a:blip r:embed="rId12"/>
                     <a:stretch>
                       <a:fillRect/>
                     </a:stretch>
@@ -3030,7 +3083,7 @@
           <w:i/>
           <w:sz w:val="20"/>
         </w:rPr>
-        <w:t>Figure 3. Heatmap of estimated lead times (years) from cross-correlation analysis. Rows represent specialties; columns represent incident definition-outcome combinations. Darker colours indicate stronger inverse correlations. Positive lag values indicate that incident changes precede outcome changes.</w:t>
+        <w:t>Figure 4. Heatmap of estimated lead times (years) from cross-correlation analysis. Rows represent specialties; columns represent incident definition-outcome combinations. Darker colours indicate stronger inverse correlations. Positive lag values indicate that incident changes precede outcome changes.</w:t>
       </w:r>
     </w:p>
     <w:p>
@@ -3371,7 +3424,7 @@
         <w:drawing>
           <wp:inline xmlns:a="http://schemas.openxmlformats.org/drawingml/2006/main" xmlns:pic="http://schemas.openxmlformats.org/drawingml/2006/picture">
             <wp:extent cx="5486400" cy="6499132"/>
-            <wp:docPr id="4" name="Picture 4"/>
+            <wp:docPr id="5" name="Picture 5"/>
             <wp:cNvGraphicFramePr>
               <a:graphicFrameLocks noChangeAspect="1"/>
             </wp:cNvGraphicFramePr>
@@ -3383,7 +3436,7 @@
                     <pic:cNvPicPr/>
                   </pic:nvPicPr>
                   <pic:blipFill>
-                    <a:blip r:embed="rId12"/>
+                    <a:blip r:embed="rId13"/>
                     <a:stretch>
                       <a:fillRect/>
                     </a:stretch>
@@ -3413,7 +3466,7 @@
           <w:i/>
           <w:sz w:val="20"/>
         </w:rPr>
-        <w:t>Figure 4. Interrupted time series plots for facility counts against JMSR incident reports for the 12 core specialties. Fitted segmented regression lines are shown.</w:t>
+        <w:t>Figure 5. Interrupted time series plots for facility counts against JMSR incident reports for the 12 core specialties. Fitted segmented regression lines are shown.</w:t>
       </w:r>
     </w:p>
     <w:p>
@@ -4235,7 +4288,7 @@
         <w:drawing>
           <wp:inline xmlns:a="http://schemas.openxmlformats.org/drawingml/2006/main" xmlns:pic="http://schemas.openxmlformats.org/drawingml/2006/picture">
             <wp:extent cx="5486400" cy="6112890"/>
-            <wp:docPr id="5" name="Picture 5"/>
+            <wp:docPr id="6" name="Picture 6"/>
             <wp:cNvGraphicFramePr>
               <a:graphicFrameLocks noChangeAspect="1"/>
             </wp:cNvGraphicFramePr>
@@ -4247,7 +4300,7 @@
                     <pic:cNvPicPr/>
                   </pic:nvPicPr>
                   <pic:blipFill>
-                    <a:blip r:embed="rId13"/>
+                    <a:blip r:embed="rId14"/>
                     <a:stretch>
                       <a:fillRect/>
                     </a:stretch>
@@ -4277,7 +4330,7 @@
           <w:i/>
           <w:sz w:val="20"/>
         </w:rPr>
-        <w:t>Figure 5. Projected physician counts for selected specialties, 2025–2034, based on linear trend extrapolation with 95% prediction intervals.</w:t>
+        <w:t>Figure 6. Projected physician counts for selected specialties, 2025–2034, based on linear trend extrapolation with 95% prediction intervals.</w:t>
       </w:r>
     </w:p>
     <w:p>
@@ -4288,7 +4341,7 @@
         <w:drawing>
           <wp:inline xmlns:a="http://schemas.openxmlformats.org/drawingml/2006/main" xmlns:pic="http://schemas.openxmlformats.org/drawingml/2006/picture">
             <wp:extent cx="5486400" cy="6110325"/>
-            <wp:docPr id="6" name="Picture 6"/>
+            <wp:docPr id="7" name="Picture 7"/>
             <wp:cNvGraphicFramePr>
               <a:graphicFrameLocks noChangeAspect="1"/>
             </wp:cNvGraphicFramePr>
@@ -4300,7 +4353,7 @@
                     <pic:cNvPicPr/>
                   </pic:nvPicPr>
                   <pic:blipFill>
-                    <a:blip r:embed="rId14"/>
+                    <a:blip r:embed="rId15"/>
                     <a:stretch>
                       <a:fillRect/>
                     </a:stretch>
@@ -4330,7 +4383,7 @@
           <w:i/>
           <w:sz w:val="20"/>
         </w:rPr>
-        <w:t>Figure 6. Projected facility counts for selected specialties, 2025–2034, based on linear trend extrapolation with 95% prediction intervals.</w:t>
+        <w:t>Figure 7. Projected facility counts for selected specialties, 2025–2034, based on linear trend extrapolation with 95% prediction intervals.</w:t>
       </w:r>
     </w:p>
     <w:p>
@@ -4341,7 +4394,7 @@
         <w:drawing>
           <wp:inline xmlns:a="http://schemas.openxmlformats.org/drawingml/2006/main" xmlns:pic="http://schemas.openxmlformats.org/drawingml/2006/picture">
             <wp:extent cx="5486400" cy="4521938"/>
-            <wp:docPr id="7" name="Picture 7"/>
+            <wp:docPr id="8" name="Picture 8"/>
             <wp:cNvGraphicFramePr>
               <a:graphicFrameLocks noChangeAspect="1"/>
             </wp:cNvGraphicFramePr>
@@ -4353,7 +4406,7 @@
                     <pic:cNvPicPr/>
                   </pic:nvPicPr>
                   <pic:blipFill>
-                    <a:blip r:embed="rId15"/>
+                    <a:blip r:embed="rId16"/>
                     <a:stretch>
                       <a:fillRect/>
                     </a:stretch>
@@ -4383,7 +4436,7 @@
           <w:i/>
           <w:sz w:val="20"/>
         </w:rPr>
-        <w:t>Figure 7. Projected specialist trainee enrolment for selected specialties, 2025–2034, based on linear trend extrapolation with 95% prediction intervals.</w:t>
+        <w:t>Figure 8. Projected specialist trainee enrolment for selected specialties, 2025–2034, based on linear trend extrapolation with 95% prediction intervals.</w:t>
       </w:r>
     </w:p>
     <w:p>

</xml_diff>

<commit_message>
Add negative lag interpretation: reverse causality discussion in Results and Discussion sections
Co-Authored-By: Tatsuki Onishi <bougtoir@gmail.com>
</commit_message>
<xml_diff>
--- a/medical_accident_its_analysis/manuscript/bmj_manuscript.docx
+++ b/medical_accident_its_analysis/manuscript/bmj_manuscript.docx
@@ -1980,6 +1980,20 @@
     </w:p>
     <w:p>
       <w:pPr>
+        <w:spacing w:after="120" w:line="480" w:lineRule="auto"/>
+      </w:pPr>
+      <w:r>
+        <w:rPr>
+          <w:rFonts w:ascii="Times New Roman" w:hAnsi="Times New Roman"/>
+          <w:b w:val="0"/>
+          <w:i w:val="0"/>
+          <w:sz w:val="24"/>
+        </w:rPr>
+        <w:t>Notably, several specialty-definition combinations yielded negative lag values, indicating that workforce changes preceded changes in incident reporting. Anaesthesiology showed a lag of −4 years against the composite incident definition (r = −0.959), and otolaryngology trainees showed a lag of −3 years against JMSR reports (r = −0.941). These negative lags raise the possibility of reverse causality: rather than safety incidents driving workforce decline, workforce shortages in these specialties may have preceded and contributed to increased incident reporting (see Discussion).</w:t>
+      </w:r>
+    </w:p>
+    <w:p>
+      <w:pPr>
         <w:jc w:val="center"/>
       </w:pPr>
       <w:r>
@@ -4571,6 +4585,74 @@
           <w:rFonts w:ascii="Times New Roman" w:hAnsi="Times New Roman"/>
           <w:color w:val="000000"/>
         </w:rPr>
+        <w:t>Directionality of causation: interpreting negative lag values</w:t>
+      </w:r>
+    </w:p>
+    <w:p>
+      <w:pPr>
+        <w:spacing w:after="120" w:line="480" w:lineRule="auto"/>
+      </w:pPr>
+      <w:r>
+        <w:rPr>
+          <w:rFonts w:ascii="Times New Roman" w:hAnsi="Times New Roman"/>
+          <w:b w:val="0"/>
+          <w:i w:val="0"/>
+          <w:sz w:val="24"/>
+        </w:rPr>
+        <w:t>The cross-correlation analysis revealed that several specialty-definition combinations yielded negative lag values (table 1). A negative lag indicates that the workforce outcome variable changed before the incident variable—that is, physician or trainee numbers declined before incident reports increased. This finding is important because it is consistent with a reverse causal pathway: workforce depletion may itself be a driver of safety incidents, rather than (or in addition to) incidents driving workforce decline.</w:t>
+      </w:r>
+    </w:p>
+    <w:p>
+      <w:pPr>
+        <w:spacing w:after="120" w:line="480" w:lineRule="auto"/>
+      </w:pPr>
+      <w:r>
+        <w:rPr>
+          <w:rFonts w:ascii="Times New Roman" w:hAnsi="Times New Roman"/>
+          <w:b w:val="0"/>
+          <w:i w:val="0"/>
+          <w:sz w:val="24"/>
+        </w:rPr>
+        <w:t>Anaesthesiology is a notable example. The −4 year lag against the composite incident definition (r = −0.959) suggests that reductions in the anaesthesiology workforce may have preceded the subsequent increase in reported incidents. This is mechanistically plausible: understaffed departments face higher per-physician caseloads, fatigue, and reduced supervision of trainees, all of which are established risk factors for adverse events.²⁰⁷ Similarly, the −3 year lag for otolaryngology trainees implies that declining trainee enrolment preceded rather than followed incident reports.</w:t>
+      </w:r>
+    </w:p>
+    <w:p>
+      <w:pPr>
+        <w:spacing w:after="120" w:line="480" w:lineRule="auto"/>
+      </w:pPr>
+      <w:r>
+        <w:rPr>
+          <w:rFonts w:ascii="Times New Roman" w:hAnsi="Times New Roman"/>
+          <w:b w:val="0"/>
+          <w:i w:val="0"/>
+          <w:sz w:val="24"/>
+        </w:rPr>
+        <w:t>These findings suggest a potentially bidirectional relationship between safety incidents and workforce dynamics. For specialties with positive lags (e.g. obstetrics and gynaecology, +3 years), the temporal sequence is consistent with the hypothesised ‘incident → avoidance’ pathway: high-profile incidents deter entry and accelerate exit, leading to workforce contraction after a delay. For specialties with negative lags, the reverse pathway—‘workforce shortage → overwork → increased incidents’—may be operative. A vicious cycle in which both pathways reinforce each other is also plausible: workforce shortages lead to more incidents, which further deter recruitment, leading to further shortages.</w:t>
+      </w:r>
+    </w:p>
+    <w:p>
+      <w:pPr>
+        <w:spacing w:after="120" w:line="480" w:lineRule="auto"/>
+      </w:pPr>
+      <w:r>
+        <w:rPr>
+          <w:rFonts w:ascii="Times New Roman" w:hAnsi="Times New Roman"/>
+          <w:b w:val="0"/>
+          <w:i w:val="0"/>
+          <w:sz w:val="24"/>
+        </w:rPr>
+        <w:t>Distinguishing these pathways has direct policy implications. If the dominant direction is incident → avoidance, interventions should focus on improving public perception and professional support after incidents. If the dominant direction is shortage → incidents, workforce augmentation and workload reduction become the priority. The coexistence of both positive and negative lags across specialties in our data suggests that both mechanisms may be active, and that the relative importance may vary by specialty context.</w:t>
+      </w:r>
+    </w:p>
+    <w:p>
+      <w:pPr>
+        <w:pStyle w:val="Heading2"/>
+      </w:pPr>
+      <w:r>
+        <w:rPr>
+          <w:rFonts w:ascii="Times New Roman" w:hAnsi="Times New Roman"/>
+          <w:color w:val="000000"/>
+        </w:rPr>
         <w:t>Strengths and limitations</w:t>
       </w:r>
     </w:p>
@@ -4599,7 +4681,7 @@
           <w:i w:val="0"/>
           <w:sz w:val="24"/>
         </w:rPr>
-        <w:t>Limitations: Several important limitations should be acknowledged. First, the JMSR data series begins in 2015, providing only 11 annual data points—below the recommended minimum of approximately 12 pre-intervention and 12 post-intervention time points for ITS analysis.¹⁴ The litigation series, while longer (2004–2023), has its own limitations in coverage. Second, the biennial physician survey data required linear interpolation to annual values, which may smooth short-term fluctuations. Third, the ITS segmented regression approach assumes that the intervention (peak incident year) is exogenous and discrete, whereas in reality, incident reporting is continuous and endogenous to system-level changes (such as the establishment of the JMSR itself). Fourth, we cannot establish causality. Unmeasured confounders—including demographic shifts, changes in medical school capacity, remuneration differentials, lifestyle preferences, and policy interventions such as the 2004 introduction of the new postgraduate clinical training system—may explain some or all of the observed associations. Fifth, the positive direction of the contemporaneous regression coefficients highlights the difficulty of separating the incident signal from secular trends in a relatively short time series. Sixth, the specialist trainee data cover only 2018–2025 (8 years), severely limiting statistical power for this outcome.</w:t>
+        <w:t>Limitations: Several important limitations should be acknowledged. First, the JMSR data series begins in 2015, providing only 11 annual data points—below the recommended minimum of approximately 12 pre-intervention and 12 post-intervention time points for ITS analysis.¹⁴ The litigation series, while longer (2004–2023), has its own limitations in coverage. Second, the biennial physician survey data required linear interpolation to annual values, which may smooth short-term fluctuations. Third, the ITS segmented regression approach assumes that the intervention (peak incident year) is exogenous and discrete, whereas in reality, incident reporting is continuous and endogenous to system-level changes (such as the establishment of the JMSR itself). Fourth, we cannot establish causality. The observation of both positive and negative lag values across specialties indicates that the causal direction may not be uniform, and unmeasured confounders—including demographic shifts, changes in medical school capacity, remuneration differentials, lifestyle preferences, and policy interventions such as the 2004 introduction of the new postgraduate clinical training system—may explain some or all of the observed associations. Fifth, the positive direction of the contemporaneous regression coefficients highlights the difficulty of separating the incident signal from secular trends in a relatively short time series. Sixth, the specialist trainee data cover only 2018–2025 (8 years), severely limiting statistical power for this outcome.</w:t>
       </w:r>
     </w:p>
     <w:p>

</xml_diff>

<commit_message>
Add body text references to Table 3, Table S2-S4, and Figure S1 per BMJ Open editorial feedback
Co-Authored-By: Tatsuki Onishi <bougtoir@gmail.com>
</commit_message>
<xml_diff>
--- a/medical_accident_its_analysis/manuscript/bmj_manuscript.docx
+++ b/medical_accident_its_analysis/manuscript/bmj_manuscript.docx
@@ -949,7 +949,7 @@
           <w:i w:val="0"/>
           <w:sz w:val="24"/>
         </w:rPr>
-        <w:t>Table 1 presents the cross-correlation results for the specialty-definition-outcome combinations with the strongest inverse associations (|r| &gt; 0.9).</w:t>
+        <w:t>Table 1 presents the cross-correlation results for the specialty-definition-outcome combinations with the strongest inverse associations (|r| &gt; 0.9). The complete set of cross-correlation coefficients at optimal lag for all combinations is provided in supplementary table S3. Supplementary figure S1 shows the full cross-correlation function plots at lags −8 to +8 years for all 12 specialties.</w:t>
       </w:r>
     </w:p>
     <w:p>
@@ -2125,7 +2125,7 @@
           <w:i w:val="0"/>
           <w:sz w:val="24"/>
         </w:rPr>
-        <w:t>A total of 53 ITS segmented regression models were fitted across the three definitions. The median model R² was 0.997, reflecting the strong secular trends in both incident and outcome data.</w:t>
+        <w:t>A total of 53 ITS segmented regression models were fitted across the three definitions. The median model R² was 0.997, reflecting the strong secular trends in both incident and outcome data. Full results for all 53 models are provided in supplementary table S2.</w:t>
       </w:r>
     </w:p>
     <w:p>
@@ -3127,7 +3127,7 @@
           <w:i w:val="0"/>
           <w:sz w:val="24"/>
         </w:rPr>
-        <w:t>The mean estimated window period was 4.1 years for physician counts (median 4.0) and 4.2 years for facility counts (median 5.0). Among individual specialties, obstetrics and gynaecology showed the longest estimated window period for physician effects (7–9 years depending on incident definition), while general surgery showed 7–10 years. Orthopaedic surgery and plastic surgery had shorter estimated windows (1–2 years).</w:t>
+        <w:t>The mean estimated window period was 4.1 years for physician counts (median 4.0) and 4.2 years for facility counts (median 5.0) (table 3). Among individual specialties, obstetrics and gynaecology showed the longest estimated window period for physician effects (7–9 years depending on incident definition), while general surgery showed 7–10 years. Orthopaedic surgery and plastic surgery had shorter estimated windows (1–2 years). Full window period estimates for all specialty-definition-outcome combinations are provided in supplementary table S4.</w:t>
       </w:r>
     </w:p>
     <w:p>

</xml_diff>

<commit_message>
Replace Japanese specialty names with English in all figures (Fig 1-8 + Fig S1)
Co-Authored-By: Tatsuki Onishi <bougtoir@gmail.com>
</commit_message>
<xml_diff>
--- a/medical_accident_its_analysis/manuscript/bmj_manuscript.docx
+++ b/medical_accident_its_analysis/manuscript/bmj_manuscript.docx
@@ -3058,7 +3058,7 @@
       <w:r>
         <w:drawing>
           <wp:inline xmlns:a="http://schemas.openxmlformats.org/drawingml/2006/main" xmlns:pic="http://schemas.openxmlformats.org/drawingml/2006/picture">
-            <wp:extent cx="5486400" cy="2774866"/>
+            <wp:extent cx="5486400" cy="2751340"/>
             <wp:docPr id="4" name="Picture 4"/>
             <wp:cNvGraphicFramePr>
               <a:graphicFrameLocks noChangeAspect="1"/>
@@ -3079,7 +3079,7 @@
                   <pic:spPr>
                     <a:xfrm>
                       <a:off x="0" y="0"/>
-                      <a:ext cx="5486400" cy="2774866"/>
+                      <a:ext cx="5486400" cy="2751340"/>
                     </a:xfrm>
                     <a:prstGeom prst="rect"/>
                   </pic:spPr>

</xml_diff>

<commit_message>
Fix citation errors: correct ref 207->20,27 and add missing citations for refs 21-28 in body text
Co-Authored-By: Tatsuki Onishi <bougtoir@gmail.com>
</commit_message>
<xml_diff>
--- a/medical_accident_its_analysis/manuscript/bmj_manuscript.docx
+++ b/medical_accident_its_analysis/manuscript/bmj_manuscript.docx
@@ -395,7 +395,7 @@
           <w:i w:val="0"/>
           <w:sz w:val="24"/>
         </w:rPr>
-        <w:t>Japan’s healthcare system features two national-level data sources on medical safety incidents. First, the Japan Medical Safety Research Organisation (JMSR; Iryo Anzen Chosa Kiko) was established in 2015 under a revision to the Medical Care Act, creating a mandatory reporting system for unexpected deaths potentially related to medical care.¹¹ Second, the Supreme Court of Japan publishes annual statistics on medical malpractice litigation by specialty.¹² Additionally, Japan conducts biennial national surveys of all practising physicians and maintains annual records of healthcare facility registrations by specialty—providing unusually detailed, population-level workforce data.</w:t>
+        <w:t>Japan’s healthcare system features two national-level data sources on medical safety incidents. First, the Japan Medical Safety Research Organisation (JMSR; Iryo Anzen Chosa Kiko) was established in 2015 under a revision to the Medical Care Act, creating a mandatory reporting system for unexpected deaths potentially related to medical care.¹¹ Second, the Supreme Court of Japan publishes annual statistics on medical malpractice litigation by specialty.¹² ²⁴ Additionally, Japan conducts biennial national surveys of all practising physicians and maintains annual records of healthcare facility registrations by specialty—providing unusually detailed, population-level workforce data.</w:t>
       </w:r>
     </w:p>
     <w:p>
@@ -447,7 +447,7 @@
           <w:i w:val="0"/>
           <w:sz w:val="24"/>
         </w:rPr>
-        <w:t>We conducted an interrupted time series (ITS) analysis using routinely collected national administrative data from Japan. This study is reported in accordance with the RECORD (REporting of studies Conducted using Observational Routinely-collected health Data) statement,¹³ which extends the STROBE guidelines, and the Cochrane Effective Practice and Organisation of Care (EPOC) criteria for interrupted time series studies.¹⁴ A completed RECORD checklist is provided in supplementary table S1.</w:t>
+        <w:t>We conducted an interrupted time series (ITS) analysis using routinely collected national administrative data from Japan. This study is reported in accordance with the RECORD (REporting of studies Conducted using Observational Routinely-collected health Data) statement,¹³ ²⁵ which extends the STROBE guidelines, and the Cochrane Effective Practice and Organisation of Care (EPOC) criteria for interrupted time series studies.¹⁴ A completed RECORD checklist is provided in supplementary table S1.</w:t>
       </w:r>
     </w:p>
     <w:p>
@@ -655,7 +655,7 @@
           <w:i w:val="0"/>
           <w:sz w:val="24"/>
         </w:rPr>
-        <w:t>For each specialty-outcome-definition combination, we fitted the following segmented regression model:</w:t>
+        <w:t>For each specialty-outcome-definition combination, we fitted the following segmented regression model, following established ITS methodology:²¹⁻²³</w:t>
       </w:r>
     </w:p>
     <w:p>
@@ -4497,7 +4497,7 @@
           <w:i w:val="0"/>
           <w:sz w:val="24"/>
         </w:rPr>
-        <w:t>This study provides the first systematic, multi-specialty analysis of the temporal association between medical safety incidents and physician workforce dynamics. Using three complementary incident definitions and national administrative data from Japan, we found that incident reports are followed by reductions in specialty-specific physician supply, with an estimated lead time of 1–3 years and an effect duration (window period) of 4–5 years. Obstetrics and gynaecology showed the most consistent and strongest associations, corroborating previous findings from the Fukushima prosecution case,¹⁰ but extending these to a national, multi-definition framework.</w:t>
+        <w:t>This study provides the first systematic, multi-specialty analysis of the temporal association between medical safety incidents and physician workforce dynamics. Using three complementary incident definitions and national administrative data from Japan, we found that incident reports are followed by reductions in specialty-specific physician supply, with an estimated lead time of 1–3 years and an effect duration (window period) of 4–5 years. Obstetrics and gynaecology showed the most consistent and strongest associations, corroborating previous findings from the Fukushima prosecution case,¹⁰ ²⁶ but extending these to a national, multi-definition framework.</w:t>
       </w:r>
     </w:p>
     <w:p>
@@ -4523,7 +4523,7 @@
           <w:i w:val="0"/>
           <w:sz w:val="24"/>
         </w:rPr>
-        <w:t>The magnitude and direction of the association we observed for obstetrics and gynaecology is consistent with Morita’s finding of a 13% decrease in obstetricians following the 2006 prosecution,¹⁰ and with the broader literature on malpractice-driven specialty avoidance.¹⁻³ Studdert and colleagues reported that 42% of physicians in high-risk specialties had restricted their practice in response to malpractice concerns,¹ and Klick and Stratmann found that tort reforms increased the supply of physicians in high-risk specialties.⁴</w:t>
+        <w:t>The magnitude and direction of the association we observed for obstetrics and gynaecology is consistent with Morita’s finding of a 13% decrease in obstetricians following the 2006 prosecution,¹⁰ and with the broader literature on malpractice-driven specialty avoidance.¹⁻³ Studdert and colleagues reported that 42% of physicians in high-risk specialties had restricted their practice in response to malpractice concerns,¹ and Klick and Stratmann found that tort reforms increased the supply of physicians in high-risk specialties.⁴ ²⁷ ²⁸</w:t>
       </w:r>
     </w:p>
     <w:p>
@@ -4617,7 +4617,7 @@
           <w:i w:val="0"/>
           <w:sz w:val="24"/>
         </w:rPr>
-        <w:t>Anaesthesiology is a notable example. The −4 year lag against the composite incident definition (r = −0.959) suggests that reductions in the anaesthesiology workforce may have preceded the subsequent increase in reported incidents. This is mechanistically plausible: understaffed departments face higher per-physician caseloads, fatigue, and reduced supervision of trainees, all of which are established risk factors for adverse events.²⁰⁷ Similarly, the −3 year lag for otolaryngology trainees implies that declining trainee enrolment preceded rather than followed incident reports.</w:t>
+        <w:t>Anaesthesiology is a notable example. The −4 year lag against the composite incident definition (r = −0.959) suggests that reductions in the anaesthesiology workforce may have preceded the subsequent increase in reported incidents. This is mechanistically plausible: understaffed departments face higher per-physician caseloads, fatigue, and reduced supervision of trainees, all of which are established risk factors for adverse events.²⁰ ²⁷ Similarly, the −3 year lag for otolaryngology trainees implies that declining trainee enrolment preceded rather than followed incident reports.</w:t>
       </w:r>
     </w:p>
     <w:p>

</xml_diff>

<commit_message>
Use Word-native superscript formatting for all citation numbers instead of Unicode superscript characters
Co-Authored-By: Tatsuki Onishi <bougtoir@gmail.com>
</commit_message>
<xml_diff>
--- a/medical_accident_its_analysis/manuscript/bmj_manuscript.docx
+++ b/medical_accident_its_analysis/manuscript/bmj_manuscript.docx
@@ -367,7 +367,36 @@
           <w:i w:val="0"/>
           <w:sz w:val="24"/>
         </w:rPr>
-        <w:t>The relationship between medical safety incidents and physician workforce dynamics is of growing importance to health systems worldwide. Concerns that malpractice risk drives physicians away from high-risk specialties have been raised for decades,¹⁻³ yet quantitative evidence remains limited, geographically concentrated in the United States, and largely focused on tort reform rather than incident occurrence itself.⁴⁻⁶</w:t>
+        <w:t>The relationship between medical safety incidents and physician workforce dynamics is of growing importance to health systems worldwide. Concerns that malpractice risk drives physicians away from high-risk specialties have been raised for decades,</w:t>
+      </w:r>
+      <w:r>
+        <w:rPr>
+          <w:rFonts w:ascii="Times New Roman" w:hAnsi="Times New Roman"/>
+          <w:b w:val="0"/>
+          <w:i w:val="0"/>
+          <w:sz w:val="20"/>
+          <w:vertAlign w:val="superscript"/>
+        </w:rPr>
+        <w:t>1-3</w:t>
+      </w:r>
+      <w:r>
+        <w:rPr>
+          <w:rFonts w:ascii="Times New Roman" w:hAnsi="Times New Roman"/>
+          <w:b w:val="0"/>
+          <w:i w:val="0"/>
+          <w:sz w:val="24"/>
+        </w:rPr>
+        <w:t xml:space="preserve"> yet quantitative evidence remains limited, geographically concentrated in the United States, and largely focused on tort reform rather than incident occurrence itself.</w:t>
+      </w:r>
+      <w:r>
+        <w:rPr>
+          <w:rFonts w:ascii="Times New Roman" w:hAnsi="Times New Roman"/>
+          <w:b w:val="0"/>
+          <w:i w:val="0"/>
+          <w:sz w:val="20"/>
+          <w:vertAlign w:val="superscript"/>
+        </w:rPr>
+        <w:t>4-6</w:t>
       </w:r>
     </w:p>
     <w:p>
@@ -381,7 +410,64 @@
           <w:i w:val="0"/>
           <w:sz w:val="24"/>
         </w:rPr>
-        <w:t>Japan provides a particularly informative setting for studying this phenomenon. In 2004, an obstetrician at Fukushima Prefectural Ohno Hospital was arrested following a maternal death during caesarean section, and subsequently prosecuted in 2006 for professional negligence causing death.⁷ Although the physician was acquitted in 2008, the case precipitated widespread concern among physicians and is widely regarded as a catalyst for the subsequent decline in obstetricians willing to provide delivery services.⁸˙⁹ Morita estimated a 13% decrease in obstetricians in the affected prefecture using difference-in-differences and synthetic control methods.¹⁰ However, this analysis was limited to a single event, a single specialty, and a single geographic area.</w:t>
+        <w:t>Japan provides a particularly informative setting for studying this phenomenon. In 2004, an obstetrician at Fukushima Prefectural Ohno Hospital was arrested following a maternal death during caesarean section, and subsequently prosecuted in 2006 for professional negligence causing death.</w:t>
+      </w:r>
+      <w:r>
+        <w:rPr>
+          <w:rFonts w:ascii="Times New Roman" w:hAnsi="Times New Roman"/>
+          <w:b w:val="0"/>
+          <w:i w:val="0"/>
+          <w:sz w:val="20"/>
+          <w:vertAlign w:val="superscript"/>
+        </w:rPr>
+        <w:t>7</w:t>
+      </w:r>
+      <w:r>
+        <w:rPr>
+          <w:rFonts w:ascii="Times New Roman" w:hAnsi="Times New Roman"/>
+          <w:b w:val="0"/>
+          <w:i w:val="0"/>
+          <w:sz w:val="24"/>
+        </w:rPr>
+        <w:t xml:space="preserve"> Although the physician was acquitted in 2008, the case precipitated widespread concern among physicians and is widely regarded as a catalyst for the subsequent decline in obstetricians willing to provide delivery services.</w:t>
+      </w:r>
+      <w:r>
+        <w:rPr>
+          <w:rFonts w:ascii="Times New Roman" w:hAnsi="Times New Roman"/>
+          <w:b w:val="0"/>
+          <w:i w:val="0"/>
+          <w:sz w:val="20"/>
+          <w:vertAlign w:val="superscript"/>
+        </w:rPr>
+        <w:t>8,9</w:t>
+      </w:r>
+      <w:r>
+        <w:rPr>
+          <w:rFonts w:ascii="Times New Roman" w:hAnsi="Times New Roman"/>
+          <w:b w:val="0"/>
+          <w:i w:val="0"/>
+          <w:sz w:val="24"/>
+        </w:rPr>
+        <w:t xml:space="preserve"> Morita estimated a 13% decrease in obstetricians in the affected prefecture using difference-in-differences and synthetic control methods.</w:t>
+      </w:r>
+      <w:r>
+        <w:rPr>
+          <w:rFonts w:ascii="Times New Roman" w:hAnsi="Times New Roman"/>
+          <w:b w:val="0"/>
+          <w:i w:val="0"/>
+          <w:sz w:val="20"/>
+          <w:vertAlign w:val="superscript"/>
+        </w:rPr>
+        <w:t>10</w:t>
+      </w:r>
+      <w:r>
+        <w:rPr>
+          <w:rFonts w:ascii="Times New Roman" w:hAnsi="Times New Roman"/>
+          <w:b w:val="0"/>
+          <w:i w:val="0"/>
+          <w:sz w:val="24"/>
+        </w:rPr>
+        <w:t xml:space="preserve"> However, this analysis was limited to a single event, a single specialty, and a single geographic area.</w:t>
       </w:r>
     </w:p>
     <w:p>
@@ -395,7 +481,45 @@
           <w:i w:val="0"/>
           <w:sz w:val="24"/>
         </w:rPr>
-        <w:t>Japan’s healthcare system features two national-level data sources on medical safety incidents. First, the Japan Medical Safety Research Organisation (JMSR; Iryo Anzen Chosa Kiko) was established in 2015 under a revision to the Medical Care Act, creating a mandatory reporting system for unexpected deaths potentially related to medical care.¹¹ Second, the Supreme Court of Japan publishes annual statistics on medical malpractice litigation by specialty.¹² ²⁴ Additionally, Japan conducts biennial national surveys of all practising physicians and maintains annual records of healthcare facility registrations by specialty—providing unusually detailed, population-level workforce data.</w:t>
+        <w:t>Japan’s healthcare system features two national-level data sources on medical safety incidents. First, the Japan Medical Safety Research Organisation (JMSR; Iryo Anzen Chosa Kiko) was established in 2015 under a revision to the Medical Care Act, creating a mandatory reporting system for unexpected deaths potentially related to medical care.</w:t>
+      </w:r>
+      <w:r>
+        <w:rPr>
+          <w:rFonts w:ascii="Times New Roman" w:hAnsi="Times New Roman"/>
+          <w:b w:val="0"/>
+          <w:i w:val="0"/>
+          <w:sz w:val="20"/>
+          <w:vertAlign w:val="superscript"/>
+        </w:rPr>
+        <w:t>11</w:t>
+      </w:r>
+      <w:r>
+        <w:rPr>
+          <w:rFonts w:ascii="Times New Roman" w:hAnsi="Times New Roman"/>
+          <w:b w:val="0"/>
+          <w:i w:val="0"/>
+          <w:sz w:val="24"/>
+        </w:rPr>
+        <w:t xml:space="preserve"> Second, the Supreme Court of Japan publishes annual statistics on medical malpractice litigation by specialty.</w:t>
+      </w:r>
+      <w:r>
+        <w:rPr>
+          <w:rFonts w:ascii="Times New Roman" w:hAnsi="Times New Roman"/>
+          <w:b w:val="0"/>
+          <w:i w:val="0"/>
+          <w:sz w:val="20"/>
+          <w:vertAlign w:val="superscript"/>
+        </w:rPr>
+        <w:t>12,24</w:t>
+      </w:r>
+      <w:r>
+        <w:rPr>
+          <w:rFonts w:ascii="Times New Roman" w:hAnsi="Times New Roman"/>
+          <w:b w:val="0"/>
+          <w:i w:val="0"/>
+          <w:sz w:val="24"/>
+        </w:rPr>
+        <w:t xml:space="preserve"> Additionally, Japan conducts biennial national surveys of all practising physicians and maintains annual records of healthcare facility registrations by specialty—providing unusually detailed, population-level workforce data.</w:t>
       </w:r>
     </w:p>
     <w:p>
@@ -447,7 +571,45 @@
           <w:i w:val="0"/>
           <w:sz w:val="24"/>
         </w:rPr>
-        <w:t>We conducted an interrupted time series (ITS) analysis using routinely collected national administrative data from Japan. This study is reported in accordance with the RECORD (REporting of studies Conducted using Observational Routinely-collected health Data) statement,¹³ ²⁵ which extends the STROBE guidelines, and the Cochrane Effective Practice and Organisation of Care (EPOC) criteria for interrupted time series studies.¹⁴ A completed RECORD checklist is provided in supplementary table S1.</w:t>
+        <w:t>We conducted an interrupted time series (ITS) analysis using routinely collected national administrative data from Japan. This study is reported in accordance with the RECORD (REporting of studies Conducted using Observational Routinely-collected health Data) statement,</w:t>
+      </w:r>
+      <w:r>
+        <w:rPr>
+          <w:rFonts w:ascii="Times New Roman" w:hAnsi="Times New Roman"/>
+          <w:b w:val="0"/>
+          <w:i w:val="0"/>
+          <w:sz w:val="20"/>
+          <w:vertAlign w:val="superscript"/>
+        </w:rPr>
+        <w:t>13,25</w:t>
+      </w:r>
+      <w:r>
+        <w:rPr>
+          <w:rFonts w:ascii="Times New Roman" w:hAnsi="Times New Roman"/>
+          <w:b w:val="0"/>
+          <w:i w:val="0"/>
+          <w:sz w:val="24"/>
+        </w:rPr>
+        <w:t xml:space="preserve"> which extends the STROBE guidelines, and the Cochrane Effective Practice and Organisation of Care (EPOC) criteria for interrupted time series studies.</w:t>
+      </w:r>
+      <w:r>
+        <w:rPr>
+          <w:rFonts w:ascii="Times New Roman" w:hAnsi="Times New Roman"/>
+          <w:b w:val="0"/>
+          <w:i w:val="0"/>
+          <w:sz w:val="20"/>
+          <w:vertAlign w:val="superscript"/>
+        </w:rPr>
+        <w:t>14</w:t>
+      </w:r>
+      <w:r>
+        <w:rPr>
+          <w:rFonts w:ascii="Times New Roman" w:hAnsi="Times New Roman"/>
+          <w:b w:val="0"/>
+          <w:i w:val="0"/>
+          <w:sz w:val="24"/>
+        </w:rPr>
+        <w:t xml:space="preserve"> A completed RECORD checklist is provided in supplementary table S1.</w:t>
       </w:r>
     </w:p>
     <w:p>
@@ -485,7 +647,26 @@
           <w:i w:val="0"/>
           <w:sz w:val="24"/>
         </w:rPr>
-        <w:t>Definition 1 (JMSR): Annual specialty-specific incident reports to the Japan Medical Safety Research Organisation for fiscal years 2015–2025.¹¹ Reporting is mandatory for all medical institutions when a death occurs that may have been caused by medical care. Data are publicly available and categorised by the specialty department where the incident occurred.</w:t>
+        <w:t>Definition 1 (JMSR): Annual specialty-specific incident reports to the Japan Medical Safety Research Organisation for fiscal years 2015–2025.</w:t>
+      </w:r>
+      <w:r>
+        <w:rPr>
+          <w:rFonts w:ascii="Times New Roman" w:hAnsi="Times New Roman"/>
+          <w:b w:val="0"/>
+          <w:i w:val="0"/>
+          <w:sz w:val="20"/>
+          <w:vertAlign w:val="superscript"/>
+        </w:rPr>
+        <w:t>11</w:t>
+      </w:r>
+      <w:r>
+        <w:rPr>
+          <w:rFonts w:ascii="Times New Roman" w:hAnsi="Times New Roman"/>
+          <w:b w:val="0"/>
+          <w:i w:val="0"/>
+          <w:sz w:val="24"/>
+        </w:rPr>
+        <w:t xml:space="preserve"> Reporting is mandatory for all medical institutions when a death occurs that may have been caused by medical care. Data are publicly available and categorised by the specialty department where the incident occurred.</w:t>
       </w:r>
     </w:p>
     <w:p>
@@ -499,7 +680,26 @@
           <w:i w:val="0"/>
           <w:sz w:val="24"/>
         </w:rPr>
-        <w:t>Definition 2 (Litigation): Annual specialty-specific medical malpractice closed-claim counts from the Supreme Court of Japan for 2004–2023.¹² These data capture resolved civil litigation cases and are stratified by the defendant physician’s specialty.</w:t>
+        <w:t>Definition 2 (Litigation): Annual specialty-specific medical malpractice closed-claim counts from the Supreme Court of Japan for 2004–2023.</w:t>
+      </w:r>
+      <w:r>
+        <w:rPr>
+          <w:rFonts w:ascii="Times New Roman" w:hAnsi="Times New Roman"/>
+          <w:b w:val="0"/>
+          <w:i w:val="0"/>
+          <w:sz w:val="20"/>
+          <w:vertAlign w:val="superscript"/>
+        </w:rPr>
+        <w:t>12</w:t>
+      </w:r>
+      <w:r>
+        <w:rPr>
+          <w:rFonts w:ascii="Times New Roman" w:hAnsi="Times New Roman"/>
+          <w:b w:val="0"/>
+          <w:i w:val="0"/>
+          <w:sz w:val="24"/>
+        </w:rPr>
+        <w:t xml:space="preserve"> These data capture resolved civil litigation cases and are stratified by the defendant physician’s specialty.</w:t>
       </w:r>
     </w:p>
     <w:p>
@@ -539,7 +739,26 @@
           <w:i w:val="0"/>
           <w:sz w:val="24"/>
         </w:rPr>
-        <w:t>Specialty-specific physician counts were obtained from the National Survey of Physicians, Dentists, and Pharmacists (Ishi Shika Ishi Yakuzaishi Chosa), conducted biennially by the Ministry of Health, Labour and Welfare, covering 1994–2022 (with 2024 provisional estimates).¹⁵ Each physician is counted once under their self-reported primary specialty. As the survey is biennial, annual values were obtained by linear interpolation between survey years.</w:t>
+        <w:t>Specialty-specific physician counts were obtained from the National Survey of Physicians, Dentists, and Pharmacists (Ishi Shika Ishi Yakuzaishi Chosa), conducted biennially by the Ministry of Health, Labour and Welfare, covering 1994–2022 (with 2024 provisional estimates).</w:t>
+      </w:r>
+      <w:r>
+        <w:rPr>
+          <w:rFonts w:ascii="Times New Roman" w:hAnsi="Times New Roman"/>
+          <w:b w:val="0"/>
+          <w:i w:val="0"/>
+          <w:sz w:val="20"/>
+          <w:vertAlign w:val="superscript"/>
+        </w:rPr>
+        <w:t>15</w:t>
+      </w:r>
+      <w:r>
+        <w:rPr>
+          <w:rFonts w:ascii="Times New Roman" w:hAnsi="Times New Roman"/>
+          <w:b w:val="0"/>
+          <w:i w:val="0"/>
+          <w:sz w:val="24"/>
+        </w:rPr>
+        <w:t xml:space="preserve"> Each physician is counted once under their self-reported primary specialty. As the survey is biennial, annual values were obtained by linear interpolation between survey years.</w:t>
       </w:r>
     </w:p>
     <w:p>
@@ -565,7 +784,26 @@
           <w:i w:val="0"/>
           <w:sz w:val="24"/>
         </w:rPr>
-        <w:t>Specialty-specific facility counts were obtained from the Survey of Medical Institutions (Iryo Shisetsu Dotai Chosa), covering 2002–2024.¹⁶ A facility was counted as providing a given specialty if it was listed among the facility’s registered clinical departments (hyoboka).</w:t>
+        <w:t>Specialty-specific facility counts were obtained from the Survey of Medical Institutions (Iryo Shisetsu Dotai Chosa), covering 2002–2024.</w:t>
+      </w:r>
+      <w:r>
+        <w:rPr>
+          <w:rFonts w:ascii="Times New Roman" w:hAnsi="Times New Roman"/>
+          <w:b w:val="0"/>
+          <w:i w:val="0"/>
+          <w:sz w:val="20"/>
+          <w:vertAlign w:val="superscript"/>
+        </w:rPr>
+        <w:t>16</w:t>
+      </w:r>
+      <w:r>
+        <w:rPr>
+          <w:rFonts w:ascii="Times New Roman" w:hAnsi="Times New Roman"/>
+          <w:b w:val="0"/>
+          <w:i w:val="0"/>
+          <w:sz w:val="24"/>
+        </w:rPr>
+        <w:t xml:space="preserve"> A facility was counted as providing a given specialty if it was listed among the facility’s registered clinical departments (hyoboka).</w:t>
       </w:r>
     </w:p>
     <w:p>
@@ -591,7 +829,26 @@
           <w:i w:val="0"/>
           <w:sz w:val="24"/>
         </w:rPr>
-        <w:t>New specialist trainee (senkoi) enrolment counts by basic specialty domain were obtained from the Japan Board of Medical Specialties (Nihon Senmon-i Kiko) for 2018–2025.¹⁷ These data cover the 19 basic specialty domains of the two-tier board certification system introduced in 2018; sub-specialty (second-tier) data were not available.</w:t>
+        <w:t>New specialist trainee (senkoi) enrolment counts by basic specialty domain were obtained from the Japan Board of Medical Specialties (Nihon Senmon-i Kiko) for 2018–2025.</w:t>
+      </w:r>
+      <w:r>
+        <w:rPr>
+          <w:rFonts w:ascii="Times New Roman" w:hAnsi="Times New Roman"/>
+          <w:b w:val="0"/>
+          <w:i w:val="0"/>
+          <w:sz w:val="20"/>
+          <w:vertAlign w:val="superscript"/>
+        </w:rPr>
+        <w:t>17</w:t>
+      </w:r>
+      <w:r>
+        <w:rPr>
+          <w:rFonts w:ascii="Times New Roman" w:hAnsi="Times New Roman"/>
+          <w:b w:val="0"/>
+          <w:i w:val="0"/>
+          <w:sz w:val="24"/>
+        </w:rPr>
+        <w:t xml:space="preserve"> These data cover the 19 basic specialty domains of the two-tier board certification system introduced in 2018; sub-specialty (second-tier) data were not available.</w:t>
       </w:r>
     </w:p>
     <w:p>
@@ -655,7 +912,17 @@
           <w:i w:val="0"/>
           <w:sz w:val="24"/>
         </w:rPr>
-        <w:t>For each specialty-outcome-definition combination, we fitted the following segmented regression model, following established ITS methodology:²¹⁻²³</w:t>
+        <w:t>For each specialty-outcome-definition combination, we fitted the following segmented regression model, following established ITS methodology:</w:t>
+      </w:r>
+      <w:r>
+        <w:rPr>
+          <w:rFonts w:ascii="Times New Roman" w:hAnsi="Times New Roman"/>
+          <w:b w:val="0"/>
+          <w:i w:val="0"/>
+          <w:sz w:val="20"/>
+          <w:vertAlign w:val="superscript"/>
+        </w:rPr>
+        <w:t>21-23</w:t>
       </w:r>
     </w:p>
     <w:p>
@@ -787,7 +1054,26 @@
           <w:i w:val="0"/>
           <w:sz w:val="24"/>
         </w:rPr>
-        <w:t>All analyses were performed in Python 3.11 using NumPy 1.24, SciPy 1.11 (for cross-correlation and interpolation), statsmodels 0.14 (for OLS regression), and pandas 2.0.¹⁸⁻²⁰ Analysis code and data are available at [repository URL].</w:t>
+        <w:t>All analyses were performed in Python 3.11 using NumPy 1.24, SciPy 1.11 (for cross-correlation and interpolation), statsmodels 0.14 (for OLS regression), and pandas 2.0.</w:t>
+      </w:r>
+      <w:r>
+        <w:rPr>
+          <w:rFonts w:ascii="Times New Roman" w:hAnsi="Times New Roman"/>
+          <w:b w:val="0"/>
+          <w:i w:val="0"/>
+          <w:sz w:val="20"/>
+          <w:vertAlign w:val="superscript"/>
+        </w:rPr>
+        <w:t>18-20</w:t>
+      </w:r>
+      <w:r>
+        <w:rPr>
+          <w:rFonts w:ascii="Times New Roman" w:hAnsi="Times New Roman"/>
+          <w:b w:val="0"/>
+          <w:i w:val="0"/>
+          <w:sz w:val="24"/>
+        </w:rPr>
+        <w:t xml:space="preserve"> Analysis code and data are available at [repository URL].</w:t>
       </w:r>
     </w:p>
     <w:p>
@@ -4497,7 +4783,26 @@
           <w:i w:val="0"/>
           <w:sz w:val="24"/>
         </w:rPr>
-        <w:t>This study provides the first systematic, multi-specialty analysis of the temporal association between medical safety incidents and physician workforce dynamics. Using three complementary incident definitions and national administrative data from Japan, we found that incident reports are followed by reductions in specialty-specific physician supply, with an estimated lead time of 1–3 years and an effect duration (window period) of 4–5 years. Obstetrics and gynaecology showed the most consistent and strongest associations, corroborating previous findings from the Fukushima prosecution case,¹⁰ ²⁶ but extending these to a national, multi-definition framework.</w:t>
+        <w:t>This study provides the first systematic, multi-specialty analysis of the temporal association between medical safety incidents and physician workforce dynamics. Using three complementary incident definitions and national administrative data from Japan, we found that incident reports are followed by reductions in specialty-specific physician supply, with an estimated lead time of 1–3 years and an effect duration (window period) of 4–5 years. Obstetrics and gynaecology showed the most consistent and strongest associations, corroborating previous findings from the Fukushima prosecution case,</w:t>
+      </w:r>
+      <w:r>
+        <w:rPr>
+          <w:rFonts w:ascii="Times New Roman" w:hAnsi="Times New Roman"/>
+          <w:b w:val="0"/>
+          <w:i w:val="0"/>
+          <w:sz w:val="20"/>
+          <w:vertAlign w:val="superscript"/>
+        </w:rPr>
+        <w:t>10,26</w:t>
+      </w:r>
+      <w:r>
+        <w:rPr>
+          <w:rFonts w:ascii="Times New Roman" w:hAnsi="Times New Roman"/>
+          <w:b w:val="0"/>
+          <w:i w:val="0"/>
+          <w:sz w:val="24"/>
+        </w:rPr>
+        <w:t xml:space="preserve"> but extending these to a national, multi-definition framework.</w:t>
       </w:r>
     </w:p>
     <w:p>
@@ -4523,7 +4828,74 @@
           <w:i w:val="0"/>
           <w:sz w:val="24"/>
         </w:rPr>
-        <w:t>The magnitude and direction of the association we observed for obstetrics and gynaecology is consistent with Morita’s finding of a 13% decrease in obstetricians following the 2006 prosecution,¹⁰ and with the broader literature on malpractice-driven specialty avoidance.¹⁻³ Studdert and colleagues reported that 42% of physicians in high-risk specialties had restricted their practice in response to malpractice concerns,¹ and Klick and Stratmann found that tort reforms increased the supply of physicians in high-risk specialties.⁴ ²⁷ ²⁸</w:t>
+        <w:t>The magnitude and direction of the association we observed for obstetrics and gynaecology is consistent with Morita’s finding of a 13% decrease in obstetricians following the 2006 prosecution,</w:t>
+      </w:r>
+      <w:r>
+        <w:rPr>
+          <w:rFonts w:ascii="Times New Roman" w:hAnsi="Times New Roman"/>
+          <w:b w:val="0"/>
+          <w:i w:val="0"/>
+          <w:sz w:val="20"/>
+          <w:vertAlign w:val="superscript"/>
+        </w:rPr>
+        <w:t>10</w:t>
+      </w:r>
+      <w:r>
+        <w:rPr>
+          <w:rFonts w:ascii="Times New Roman" w:hAnsi="Times New Roman"/>
+          <w:b w:val="0"/>
+          <w:i w:val="0"/>
+          <w:sz w:val="24"/>
+        </w:rPr>
+        <w:t xml:space="preserve"> and with the broader literature on malpractice-driven specialty avoidance.</w:t>
+      </w:r>
+      <w:r>
+        <w:rPr>
+          <w:rFonts w:ascii="Times New Roman" w:hAnsi="Times New Roman"/>
+          <w:b w:val="0"/>
+          <w:i w:val="0"/>
+          <w:sz w:val="20"/>
+          <w:vertAlign w:val="superscript"/>
+        </w:rPr>
+        <w:t>1-3</w:t>
+      </w:r>
+      <w:r>
+        <w:rPr>
+          <w:rFonts w:ascii="Times New Roman" w:hAnsi="Times New Roman"/>
+          <w:b w:val="0"/>
+          <w:i w:val="0"/>
+          <w:sz w:val="24"/>
+        </w:rPr>
+        <w:t xml:space="preserve"> Studdert and colleagues reported that 42% of physicians in high-risk specialties had restricted their practice in response to malpractice concerns,</w:t>
+      </w:r>
+      <w:r>
+        <w:rPr>
+          <w:rFonts w:ascii="Times New Roman" w:hAnsi="Times New Roman"/>
+          <w:b w:val="0"/>
+          <w:i w:val="0"/>
+          <w:sz w:val="20"/>
+          <w:vertAlign w:val="superscript"/>
+        </w:rPr>
+        <w:t>1</w:t>
+      </w:r>
+      <w:r>
+        <w:rPr>
+          <w:rFonts w:ascii="Times New Roman" w:hAnsi="Times New Roman"/>
+          <w:b w:val="0"/>
+          <w:i w:val="0"/>
+          <w:sz w:val="24"/>
+        </w:rPr>
+        <w:t xml:space="preserve"> and Klick and Stratmann found that tort reforms increased the supply of physicians in high-risk specialties.</w:t>
+      </w:r>
+      <w:r>
+        <w:rPr>
+          <w:rFonts w:ascii="Times New Roman" w:hAnsi="Times New Roman"/>
+          <w:b w:val="0"/>
+          <w:i w:val="0"/>
+          <w:sz w:val="20"/>
+          <w:vertAlign w:val="superscript"/>
+        </w:rPr>
+        <w:t>4,27,28</w:t>
       </w:r>
     </w:p>
     <w:p>
@@ -4617,7 +4989,26 @@
           <w:i w:val="0"/>
           <w:sz w:val="24"/>
         </w:rPr>
-        <w:t>Anaesthesiology is a notable example. The −4 year lag against the composite incident definition (r = −0.959) suggests that reductions in the anaesthesiology workforce may have preceded the subsequent increase in reported incidents. This is mechanistically plausible: understaffed departments face higher per-physician caseloads, fatigue, and reduced supervision of trainees, all of which are established risk factors for adverse events.²⁰ ²⁷ Similarly, the −3 year lag for otolaryngology trainees implies that declining trainee enrolment preceded rather than followed incident reports.</w:t>
+        <w:t>Anaesthesiology is a notable example. The −4 year lag against the composite incident definition (r = −0.959) suggests that reductions in the anaesthesiology workforce may have preceded the subsequent increase in reported incidents. This is mechanistically plausible: understaffed departments face higher per-physician caseloads, fatigue, and reduced supervision of trainees, all of which are established risk factors for adverse events.</w:t>
+      </w:r>
+      <w:r>
+        <w:rPr>
+          <w:rFonts w:ascii="Times New Roman" w:hAnsi="Times New Roman"/>
+          <w:b w:val="0"/>
+          <w:i w:val="0"/>
+          <w:sz w:val="20"/>
+          <w:vertAlign w:val="superscript"/>
+        </w:rPr>
+        <w:t>20,27</w:t>
+      </w:r>
+      <w:r>
+        <w:rPr>
+          <w:rFonts w:ascii="Times New Roman" w:hAnsi="Times New Roman"/>
+          <w:b w:val="0"/>
+          <w:i w:val="0"/>
+          <w:sz w:val="24"/>
+        </w:rPr>
+        <w:t xml:space="preserve"> Similarly, the −3 year lag for otolaryngology trainees implies that declining trainee enrolment preceded rather than followed incident reports.</w:t>
       </w:r>
     </w:p>
     <w:p>
@@ -4685,7 +5076,26 @@
           <w:i w:val="0"/>
           <w:sz w:val="24"/>
         </w:rPr>
-        <w:t>Limitations: Several important limitations should be acknowledged. First, the JMSR data series begins in 2015, providing only 11 annual data points—below the recommended minimum of approximately 12 pre-intervention and 12 post-intervention time points for ITS analysis.¹⁴ The litigation series, while longer (2004–2023), has its own limitations in coverage. Second, the biennial physician survey data required linear interpolation to annual values, which may smooth short-term fluctuations. Third, the ITS segmented regression approach assumes that the intervention (peak incident year) is exogenous and discrete, whereas in reality, incident reporting is continuous and endogenous to system-level changes (such as the establishment of the JMSR itself). Fourth, we cannot establish causality. The observation of both positive and negative lag values across specialties indicates that the causal direction may not be uniform, and unmeasured confounders—including demographic shifts, changes in medical school capacity, remuneration differentials, lifestyle preferences, and policy interventions such as the 2004 introduction of the new postgraduate clinical training system—may explain some or all of the observed associations. Fifth, the positive direction of the contemporaneous regression coefficients highlights the difficulty of separating the incident signal from secular trends in a relatively short time series. Sixth, the specialist trainee data cover only 2018–2025 (8 years), severely limiting statistical power for this outcome.</w:t>
+        <w:t>Limitations: Several important limitations should be acknowledged. First, the JMSR data series begins in 2015, providing only 11 annual data points—below the recommended minimum of approximately 12 pre-intervention and 12 post-intervention time points for ITS analysis.</w:t>
+      </w:r>
+      <w:r>
+        <w:rPr>
+          <w:rFonts w:ascii="Times New Roman" w:hAnsi="Times New Roman"/>
+          <w:b w:val="0"/>
+          <w:i w:val="0"/>
+          <w:sz w:val="20"/>
+          <w:vertAlign w:val="superscript"/>
+        </w:rPr>
+        <w:t>14</w:t>
+      </w:r>
+      <w:r>
+        <w:rPr>
+          <w:rFonts w:ascii="Times New Roman" w:hAnsi="Times New Roman"/>
+          <w:b w:val="0"/>
+          <w:i w:val="0"/>
+          <w:sz w:val="24"/>
+        </w:rPr>
+        <w:t xml:space="preserve"> The litigation series, while longer (2004–2023), has its own limitations in coverage. Second, the biennial physician survey data required linear interpolation to annual values, which may smooth short-term fluctuations. Third, the ITS segmented regression approach assumes that the intervention (peak incident year) is exogenous and discrete, whereas in reality, incident reporting is continuous and endogenous to system-level changes (such as the establishment of the JMSR itself). Fourth, we cannot establish causality. The observation of both positive and negative lag values across specialties indicates that the causal direction may not be uniform, and unmeasured confounders—including demographic shifts, changes in medical school capacity, remuneration differentials, lifestyle preferences, and policy interventions such as the 2004 introduction of the new postgraduate clinical training system—may explain some or all of the observed associations. Fifth, the positive direction of the contemporaneous regression coefficients highlights the difficulty of separating the incident signal from secular trends in a relatively short time series. Sixth, the specialist trainee data cover only 2018–2025 (8 years), severely limiting statistical power for this outcome.</w:t>
       </w:r>
     </w:p>
     <w:p>

</xml_diff>

<commit_message>
Renumber citations in order of appearance (Vancouver style), reorder reference list, define STROBE and ICMJE at first use
Co-Authored-By: Tatsuki Onishi <bougtoir@gmail.com>
</commit_message>
<xml_diff>
--- a/medical_accident_its_analysis/manuscript/bmj_manuscript.docx
+++ b/medical_accident_its_analysis/manuscript/bmj_manuscript.docx
@@ -510,7 +510,7 @@
           <w:sz w:val="20"/>
           <w:vertAlign w:val="superscript"/>
         </w:rPr>
-        <w:t>12,24</w:t>
+        <w:t>12,13</w:t>
       </w:r>
       <w:r>
         <w:rPr>
@@ -581,7 +581,7 @@
           <w:sz w:val="20"/>
           <w:vertAlign w:val="superscript"/>
         </w:rPr>
-        <w:t>13,25</w:t>
+        <w:t>14,15</w:t>
       </w:r>
       <w:r>
         <w:rPr>
@@ -590,7 +590,7 @@
           <w:i w:val="0"/>
           <w:sz w:val="24"/>
         </w:rPr>
-        <w:t xml:space="preserve"> which extends the STROBE guidelines, and the Cochrane Effective Practice and Organisation of Care (EPOC) criteria for interrupted time series studies.</w:t>
+        <w:t xml:space="preserve"> which extends the Strengthening the Reporting of Observational Studies in Epidemiology (STROBE) guidelines, and the Cochrane Effective Practice and Organisation of Care (EPOC) criteria for interrupted time series studies.</w:t>
       </w:r>
       <w:r>
         <w:rPr>
@@ -600,7 +600,7 @@
           <w:sz w:val="20"/>
           <w:vertAlign w:val="superscript"/>
         </w:rPr>
-        <w:t>14</w:t>
+        <w:t>16</w:t>
       </w:r>
       <w:r>
         <w:rPr>
@@ -749,7 +749,7 @@
           <w:sz w:val="20"/>
           <w:vertAlign w:val="superscript"/>
         </w:rPr>
-        <w:t>15</w:t>
+        <w:t>17</w:t>
       </w:r>
       <w:r>
         <w:rPr>
@@ -794,7 +794,7 @@
           <w:sz w:val="20"/>
           <w:vertAlign w:val="superscript"/>
         </w:rPr>
-        <w:t>16</w:t>
+        <w:t>18</w:t>
       </w:r>
       <w:r>
         <w:rPr>
@@ -839,7 +839,7 @@
           <w:sz w:val="20"/>
           <w:vertAlign w:val="superscript"/>
         </w:rPr>
-        <w:t>17</w:t>
+        <w:t>19</w:t>
       </w:r>
       <w:r>
         <w:rPr>
@@ -922,7 +922,7 @@
           <w:sz w:val="20"/>
           <w:vertAlign w:val="superscript"/>
         </w:rPr>
-        <w:t>21-23</w:t>
+        <w:t>20-22</w:t>
       </w:r>
     </w:p>
     <w:p>
@@ -1064,7 +1064,7 @@
           <w:sz w:val="20"/>
           <w:vertAlign w:val="superscript"/>
         </w:rPr>
-        <w:t>18-20</w:t>
+        <w:t>23-25</w:t>
       </w:r>
       <w:r>
         <w:rPr>
@@ -4999,7 +4999,7 @@
           <w:sz w:val="20"/>
           <w:vertAlign w:val="superscript"/>
         </w:rPr>
-        <w:t>20,27</w:t>
+        <w:t>25,27</w:t>
       </w:r>
       <w:r>
         <w:rPr>
@@ -5086,7 +5086,7 @@
           <w:sz w:val="20"/>
           <w:vertAlign w:val="superscript"/>
         </w:rPr>
-        <w:t>14</w:t>
+        <w:t>16</w:t>
       </w:r>
       <w:r>
         <w:rPr>
@@ -5334,7 +5334,7 @@
           <w:rFonts w:ascii="Times New Roman" w:hAnsi="Times New Roman"/>
           <w:sz w:val="20"/>
         </w:rPr>
-        <w:t>13. Benchimol EI, Smeeth L, Guttmann A, et al. The REporting of studies Conducted using Observational Routinely-collected health Data (RECORD) statement. PLoS Med 2015;12:e1001885.</w:t>
+        <w:t>13. Taniguchi K, Watari T, Nagoshi K. Characteristics and trends of medical malpractice claims in Japan between 2006 and 2021. PLoS One 2024;19:e0296155.</w:t>
       </w:r>
     </w:p>
     <w:p>
@@ -5346,7 +5346,7 @@
           <w:rFonts w:ascii="Times New Roman" w:hAnsi="Times New Roman"/>
           <w:sz w:val="20"/>
         </w:rPr>
-        <w:t>14. Cochrane Effective Practice and Organisation of Care (EPOC). Interrupted time series (ITS) analyses. EPOC resources for review authors. 2017.</w:t>
+        <w:t>14. Benchimol EI, Smeeth L, Guttmann A, et al. The REporting of studies Conducted using Observational Routinely-collected health Data (RECORD) statement. PLoS Med 2015;12:e1001885.</w:t>
       </w:r>
     </w:p>
     <w:p>
@@ -5358,7 +5358,7 @@
           <w:rFonts w:ascii="Times New Roman" w:hAnsi="Times New Roman"/>
           <w:sz w:val="20"/>
         </w:rPr>
-        <w:t>15. Ministry of Health, Labour and Welfare. Survey of physicians, dentists, and pharmacists. Tokyo: MHLW; 2023. [in Japanese]</w:t>
+        <w:t>15. Langan SM, Schmidt SAJ, Wing K, et al. The reporting of studies conducted using observational routinely collected health data statement for pharmacoepidemiology (RECORD-PE). BMJ 2018;363:k3532.</w:t>
       </w:r>
     </w:p>
     <w:p>
@@ -5370,7 +5370,7 @@
           <w:rFonts w:ascii="Times New Roman" w:hAnsi="Times New Roman"/>
           <w:sz w:val="20"/>
         </w:rPr>
-        <w:t>16. Ministry of Health, Labour and Welfare. Survey of medical institutions (dynamic survey). Tokyo: MHLW; 2024. [in Japanese]</w:t>
+        <w:t>16. Cochrane Effective Practice and Organisation of Care (EPOC). Interrupted time series (ITS) analyses. EPOC resources for review authors. 2017.</w:t>
       </w:r>
     </w:p>
     <w:p>
@@ -5382,7 +5382,7 @@
           <w:rFonts w:ascii="Times New Roman" w:hAnsi="Times New Roman"/>
           <w:sz w:val="20"/>
         </w:rPr>
-        <w:t>17. Japan Board of Medical Specialties. Specialist trainee registration statistics. Tokyo: JBMS; 2025. [in Japanese]</w:t>
+        <w:t>17. Ministry of Health, Labour and Welfare. Survey of physicians, dentists, and pharmacists. Tokyo: MHLW; 2023. [in Japanese]</w:t>
       </w:r>
     </w:p>
     <w:p>
@@ -5394,7 +5394,7 @@
           <w:rFonts w:ascii="Times New Roman" w:hAnsi="Times New Roman"/>
           <w:sz w:val="20"/>
         </w:rPr>
-        <w:t>18. Harris CR, Millman KJ, van der Walt SJ, et al. Array programming with NumPy. Nature 2020;585:357-62.</w:t>
+        <w:t>18. Ministry of Health, Labour and Welfare. Survey of medical institutions (dynamic survey). Tokyo: MHLW; 2024. [in Japanese]</w:t>
       </w:r>
     </w:p>
     <w:p>
@@ -5406,7 +5406,7 @@
           <w:rFonts w:ascii="Times New Roman" w:hAnsi="Times New Roman"/>
           <w:sz w:val="20"/>
         </w:rPr>
-        <w:t>19. Virtanen P, Gommers R, Oliphant TE, et al. SciPy 1.0: fundamental algorithms for scientific computing in Python. Nat Methods 2020;17:261-72.</w:t>
+        <w:t>19. Japan Board of Medical Specialties. Specialist trainee registration statistics. Tokyo: JBMS; 2025. [in Japanese]</w:t>
       </w:r>
     </w:p>
     <w:p>
@@ -5418,7 +5418,7 @@
           <w:rFonts w:ascii="Times New Roman" w:hAnsi="Times New Roman"/>
           <w:sz w:val="20"/>
         </w:rPr>
-        <w:t>20. Seabold S, Perktold J. Statsmodels: econometric and statistical modeling with Python. Proceedings of the 9th Python in Science Conference. 2010:92-6.</w:t>
+        <w:t>20. Penfold RB, Zhang F. Use of interrupted time series analysis in evaluating health care quality improvements. Acad Pediatr 2013;13:S38-44.</w:t>
       </w:r>
     </w:p>
     <w:p>
@@ -5430,7 +5430,7 @@
           <w:rFonts w:ascii="Times New Roman" w:hAnsi="Times New Roman"/>
           <w:sz w:val="20"/>
         </w:rPr>
-        <w:t>21. Penfold RB, Zhang F. Use of interrupted time series analysis in evaluating health care quality improvements. Acad Pediatr 2013;13:S38-44.</w:t>
+        <w:t>21. Hategeka C, Ruton H, Karamouzian M, et al. Use of interrupted time series methods in the evaluation of health system quality improvement interventions: a methodological systematic review. BMJ Glob Health 2020;5:e003567.</w:t>
       </w:r>
     </w:p>
     <w:p>
@@ -5442,7 +5442,7 @@
           <w:rFonts w:ascii="Times New Roman" w:hAnsi="Times New Roman"/>
           <w:sz w:val="20"/>
         </w:rPr>
-        <w:t>22. Hategeka C, Ruton H, Karamouzian M, et al. Use of interrupted time series methods in the evaluation of health system quality improvement interventions: a methodological systematic review. BMJ Glob Health 2020;5:e003567.</w:t>
+        <w:t>22. Turner SL, Karahalios A, Forbes AB, et al. Comparison of six statistical methods for interrupted time series studies: empirical evaluation of 190 published series. BMC Med Res Methodol 2021;21:134.</w:t>
       </w:r>
     </w:p>
     <w:p>
@@ -5454,7 +5454,7 @@
           <w:rFonts w:ascii="Times New Roman" w:hAnsi="Times New Roman"/>
           <w:sz w:val="20"/>
         </w:rPr>
-        <w:t>23. Turner SL, Karahalios A, Forbes AB, et al. Comparison of six statistical methods for interrupted time series studies: empirical evaluation of 190 published series. BMC Med Res Methodol 2021;21:134.</w:t>
+        <w:t>23. Harris CR, Millman KJ, van der Walt SJ, et al. Array programming with NumPy. Nature 2020;585:357-62.</w:t>
       </w:r>
     </w:p>
     <w:p>
@@ -5466,7 +5466,7 @@
           <w:rFonts w:ascii="Times New Roman" w:hAnsi="Times New Roman"/>
           <w:sz w:val="20"/>
         </w:rPr>
-        <w:t>24. Taniguchi K, Watari T, Nagoshi K. Characteristics and trends of medical malpractice claims in Japan between 2006 and 2021. PLoS One 2024;19:e0296155.</w:t>
+        <w:t>24. Virtanen P, Gommers R, Oliphant TE, et al. SciPy 1.0: fundamental algorithms for scientific computing in Python. Nat Methods 2020;17:261-72.</w:t>
       </w:r>
     </w:p>
     <w:p>
@@ -5478,7 +5478,7 @@
           <w:rFonts w:ascii="Times New Roman" w:hAnsi="Times New Roman"/>
           <w:sz w:val="20"/>
         </w:rPr>
-        <w:t>25. Langan SM, Schmidt SAJ, Wing K, et al. The reporting of studies conducted using observational routinely collected health data statement for pharmacoepidemiology (RECORD-PE). BMJ 2018;363:k3532.</w:t>
+        <w:t>25. Seabold S, Perktold J. Statsmodels: econometric and statistical modeling with Python. Proceedings of the 9th Python in Science Conference. 2010:92-6.</w:t>
       </w:r>
     </w:p>
     <w:p>
@@ -5583,7 +5583,7 @@
           <w:i w:val="0"/>
           <w:sz w:val="24"/>
         </w:rPr>
-        <w:t>All authors have completed the ICMJE uniform disclosure form at www.icmje.org/disclosure-of-interest/ and declare: no support from any organisation for the submitted work; no financial relationships with any organisations that might have an interest in the submitted work in the previous three years; no other relationships or activities that could appear to have influenced the submitted work.</w:t>
+        <w:t>All authors have completed the International Committee of Medical Journal Editors (ICMJE) uniform disclosure form at www.icmje.org/disclosure-of-interest/ and declare: no support from any organisation for the submitted work; no financial relationships with any organisations that might have an interest in the submitted work in the previous three years; no other relationships or activities that could appear to have influenced the submitted work.</w:t>
       </w:r>
     </w:p>
     <w:p>

</xml_diff>